<commit_message>
Rebuild all Word documents with clean, fully editable formatting for Google Docs
Co-Authored-By: Claude Sonnet 4.6 <noreply@anthropic.com>
Claude-Session: https://claude.ai/code/session_01VXdBnAWV4RF8c2tdGsbE5P
</commit_message>
<xml_diff>
--- a/Myeisha_Cheek_CoverLetter_Family_Law_Paralegal_BeaconHill.docx
+++ b/Myeisha_Cheek_CoverLetter_Family_Law_Paralegal_BeaconHill.docx
@@ -4,13 +4,14 @@
   <w:body>
     <w:p>
       <w:pPr>
-        <w:spacing w:after="0" w:before="0"/>
+        <w:spacing w:before="0" w:after="40"/>
         <w:jc w:val="center"/>
       </w:pPr>
       <w:r>
         <w:rPr>
           <w:rFonts w:ascii="Times New Roman" w:hAnsi="Times New Roman"/>
           <w:b/>
+          <w:color w:val="000000"/>
           <w:sz w:val="32"/>
         </w:rPr>
         <w:t>MYEISHA L. CHEEK</w:t>
@@ -18,12 +19,14 @@
     </w:p>
     <w:p>
       <w:pPr>
-        <w:spacing w:after="80" w:before="0"/>
+        <w:spacing w:before="0" w:after="60"/>
+        <w:jc w:val="left"/>
       </w:pPr>
       <w:r>
         <w:rPr>
           <w:rFonts w:ascii="Times New Roman" w:hAnsi="Times New Roman"/>
           <w:b w:val="0"/>
+          <w:color w:val="000000"/>
           <w:sz w:val="24"/>
         </w:rPr>
         <w:t>Charlotte, NC 28273 | 864-398-3096 | myeishacheek05@gmail.com | linkedin.com/in/myeisha-cheek-</w:t>
@@ -31,24 +34,22 @@
     </w:p>
     <w:p>
       <w:pPr>
-        <w:spacing w:after="0" w:before="80"/>
+        <w:spacing w:before="40" w:after="40"/>
+        <w:pBdr>
+          <w:bottom w:val="single" w:sz="6" w:space="1" w:color="000000"/>
+        </w:pBdr>
       </w:pPr>
-      <w:r>
-        <w:rPr>
-          <w:rFonts w:ascii="Times New Roman" w:hAnsi="Times New Roman"/>
-          <w:sz w:val="16"/>
-        </w:rPr>
-        <w:t>________________________________________________________________________</w:t>
-      </w:r>
     </w:p>
     <w:p>
       <w:pPr>
-        <w:spacing w:after="80" w:before="0"/>
+        <w:spacing w:before="0" w:after="60"/>
+        <w:jc w:val="left"/>
       </w:pPr>
       <w:r>
         <w:rPr>
           <w:rFonts w:ascii="Times New Roman" w:hAnsi="Times New Roman"/>
           <w:b w:val="0"/>
+          <w:color w:val="000000"/>
           <w:sz w:val="24"/>
         </w:rPr>
         <w:t>Dear Hiring Manager,</w:t>
@@ -56,12 +57,14 @@
     </w:p>
     <w:p>
       <w:pPr>
-        <w:spacing w:after="80" w:before="0"/>
+        <w:spacing w:before="0" w:after="60"/>
+        <w:jc w:val="left"/>
       </w:pPr>
       <w:r>
         <w:rPr>
           <w:rFonts w:ascii="Times New Roman" w:hAnsi="Times New Roman"/>
           <w:b w:val="0"/>
+          <w:color w:val="000000"/>
           <w:sz w:val="24"/>
         </w:rPr>
         <w:t>I am writing to express my interest in the Family Law Paralegal position with your Charlotte office. With over five years of experience supporting attorneys in family law litigation, child welfare cases, custody disputes, and juvenile court proceedings, I am well prepared to step in and provide immediate, reliable support to your team.</w:t>
@@ -69,12 +72,14 @@
     </w:p>
     <w:p>
       <w:pPr>
-        <w:spacing w:after="80" w:before="0"/>
+        <w:spacing w:before="0" w:after="60"/>
+        <w:jc w:val="left"/>
       </w:pPr>
       <w:r>
         <w:rPr>
           <w:rFonts w:ascii="Times New Roman" w:hAnsi="Times New Roman"/>
           <w:b w:val="0"/>
+          <w:color w:val="000000"/>
           <w:sz w:val="24"/>
         </w:rPr>
         <w:t>At the Department of Social Services, I worked directly with attorneys on active family law cases, drafting pleadings, motions, discovery, court orders, and correspondence for court submission. I managed case files, maintained court calendars, tracked deadlines, and prepared complete documentation for hearings and trial. I also e-filed documents in South Carolina state and federal courts and communicated regularly with clients, opposing counsel, and court personnel. This was a fast-paced environment with multiple active matters at all times, and I was responsible for keeping cases organized and moving forward.</w:t>
@@ -82,12 +87,14 @@
     </w:p>
     <w:p>
       <w:pPr>
-        <w:spacing w:after="80" w:before="0"/>
+        <w:spacing w:before="0" w:after="60"/>
+        <w:jc w:val="left"/>
       </w:pPr>
       <w:r>
         <w:rPr>
           <w:rFonts w:ascii="Times New Roman" w:hAnsi="Times New Roman"/>
           <w:b w:val="0"/>
+          <w:color w:val="000000"/>
           <w:sz w:val="24"/>
         </w:rPr>
         <w:t>As a Juvenile Drug Court Program Coordinator, I supported attorneys in family court proceedings and served as a direct point of contact for families going through difficult legal situations. I provided consistent communication and guidance to clients throughout their cases, which I understand is a priority for your firm. I also coordinated across attorneys, judges, social workers, and treatment providers on a daily basis.</w:t>
@@ -95,12 +102,14 @@
     </w:p>
     <w:p>
       <w:pPr>
-        <w:spacing w:after="80" w:before="0"/>
+        <w:spacing w:before="0" w:after="60"/>
+        <w:jc w:val="left"/>
       </w:pPr>
       <w:r>
         <w:rPr>
           <w:rFonts w:ascii="Times New Roman" w:hAnsi="Times New Roman"/>
           <w:b w:val="0"/>
+          <w:color w:val="000000"/>
           <w:sz w:val="24"/>
         </w:rPr>
         <w:t>I am currently based in Charlotte and working as a Client Intake Coordinator at a family law firm where I manage client communications, draft legal documents, and maintain case records in Litify. I am comfortable adapting to new case management platforms and can get up to speed on MyCase quickly.</w:t>
@@ -108,12 +117,14 @@
     </w:p>
     <w:p>
       <w:pPr>
-        <w:spacing w:after="80" w:before="0"/>
+        <w:spacing w:before="0" w:after="60"/>
+        <w:jc w:val="left"/>
       </w:pPr>
       <w:r>
         <w:rPr>
           <w:rFonts w:ascii="Times New Roman" w:hAnsi="Times New Roman"/>
           <w:b w:val="0"/>
+          <w:color w:val="000000"/>
           <w:sz w:val="24"/>
         </w:rPr>
         <w:t>I am available to start immediately and would welcome the opportunity to support your attorneys during this busy period. Thank you for your consideration.</w:t>
@@ -121,12 +132,14 @@
     </w:p>
     <w:p>
       <w:pPr>
-        <w:spacing w:after="80" w:before="0"/>
+        <w:spacing w:before="0" w:after="60"/>
+        <w:jc w:val="left"/>
       </w:pPr>
       <w:r>
         <w:rPr>
           <w:rFonts w:ascii="Times New Roman" w:hAnsi="Times New Roman"/>
           <w:b w:val="0"/>
+          <w:color w:val="000000"/>
           <w:sz w:val="24"/>
         </w:rPr>
         <w:t>Sincerely,</w:t>
@@ -134,12 +147,14 @@
     </w:p>
     <w:p>
       <w:pPr>
-        <w:spacing w:after="80" w:before="0"/>
+        <w:spacing w:before="0" w:after="60"/>
+        <w:jc w:val="left"/>
       </w:pPr>
       <w:r>
         <w:rPr>
           <w:rFonts w:ascii="Times New Roman" w:hAnsi="Times New Roman"/>
           <w:b w:val="0"/>
+          <w:color w:val="000000"/>
           <w:sz w:val="24"/>
         </w:rPr>
         <w:t>Myeisha L. Cheek</w:t>
@@ -518,8 +533,12 @@
     <w:name w:val="Normal"/>
     <w:qFormat/>
     <w:rsid w:val="00FC693F"/>
+    <w:pPr>
+      <w:spacing w:after="0" w:before="0"/>
+    </w:pPr>
     <w:rPr>
       <w:rFonts w:ascii="Times New Roman" w:hAnsi="Times New Roman"/>
+      <w:color w:val="000000"/>
       <w:sz w:val="24"/>
     </w:rPr>
   </w:style>

</xml_diff>

<commit_message>
Remake all cover letters in formal format with dates, address blocks, and proper structure
Co-Authored-By: Claude Sonnet 4.6 <noreply@anthropic.com>
Claude-Session: https://claude.ai/code/session_01VXdBnAWV4RF8c2tdGsbE5P
</commit_message>
<xml_diff>
--- a/Myeisha_Cheek_CoverLetter_Family_Law_Paralegal_BeaconHill.docx
+++ b/Myeisha_Cheek_CoverLetter_Family_Law_Paralegal_BeaconHill.docx
@@ -52,6 +52,66 @@
           <w:color w:val="000000"/>
           <w:sz w:val="24"/>
         </w:rPr>
+        <w:t>June 30, 2026</w:t>
+      </w:r>
+    </w:p>
+    <w:p>
+      <w:pPr>
+        <w:spacing w:before="0" w:after="60"/>
+        <w:jc w:val="left"/>
+      </w:pPr>
+      <w:r>
+        <w:rPr>
+          <w:rFonts w:ascii="Times New Roman" w:hAnsi="Times New Roman"/>
+          <w:b w:val="0"/>
+          <w:color w:val="000000"/>
+          <w:sz w:val="24"/>
+        </w:rPr>
+        <w:t>Hiring Manager</w:t>
+      </w:r>
+    </w:p>
+    <w:p>
+      <w:pPr>
+        <w:spacing w:before="0" w:after="60"/>
+        <w:jc w:val="left"/>
+      </w:pPr>
+      <w:r>
+        <w:rPr>
+          <w:rFonts w:ascii="Times New Roman" w:hAnsi="Times New Roman"/>
+          <w:b w:val="0"/>
+          <w:color w:val="000000"/>
+          <w:sz w:val="24"/>
+        </w:rPr>
+        <w:t>Beacon Hill Legal</w:t>
+      </w:r>
+    </w:p>
+    <w:p>
+      <w:pPr>
+        <w:spacing w:before="0" w:after="60"/>
+        <w:jc w:val="left"/>
+      </w:pPr>
+      <w:r>
+        <w:rPr>
+          <w:rFonts w:ascii="Times New Roman" w:hAnsi="Times New Roman"/>
+          <w:b w:val="0"/>
+          <w:color w:val="000000"/>
+          <w:sz w:val="24"/>
+        </w:rPr>
+        <w:t>Charlotte, NC — South End</w:t>
+      </w:r>
+    </w:p>
+    <w:p>
+      <w:pPr>
+        <w:spacing w:before="0" w:after="60"/>
+        <w:jc w:val="left"/>
+      </w:pPr>
+      <w:r>
+        <w:rPr>
+          <w:rFonts w:ascii="Times New Roman" w:hAnsi="Times New Roman"/>
+          <w:b w:val="0"/>
+          <w:color w:val="000000"/>
+          <w:sz w:val="24"/>
+        </w:rPr>
         <w:t>Dear Hiring Manager,</w:t>
       </w:r>
     </w:p>
@@ -67,7 +127,7 @@
           <w:color w:val="000000"/>
           <w:sz w:val="24"/>
         </w:rPr>
-        <w:t>I am writing to express my interest in the Family Law Paralegal position with your Charlotte office. With over five years of experience supporting attorneys in family law litigation, child welfare cases, custody disputes, and juvenile court proceedings, I am well prepared to step in and provide immediate, reliable support to your team.</w:t>
+        <w:t>I am writing to apply for the Family Law Paralegal position with your Charlotte office. With over five years of experience as a paralegal focused primarily on family law matters, I am confident in my ability to provide immediate, reliable support to your team of attorneys and contribute to your clients' cases from day one.</w:t>
       </w:r>
     </w:p>
     <w:p>
@@ -82,7 +142,7 @@
           <w:color w:val="000000"/>
           <w:sz w:val="24"/>
         </w:rPr>
-        <w:t>At the Department of Social Services, I worked directly with attorneys on active family law cases, drafting pleadings, motions, discovery, court orders, and correspondence for court submission. I managed case files, maintained court calendars, tracked deadlines, and prepared complete documentation for hearings and trial. I also e-filed documents in South Carolina state and federal courts and communicated regularly with clients, opposing counsel, and court personnel. This was a fast-paced environment with multiple active matters at all times, and I was responsible for keeping cases organized and moving forward.</w:t>
+        <w:t>At the Department of Social Services, I worked directly with attorneys on active family law litigation including child welfare cases, termination of parental rights, and custody disputes. I drafted pleadings, motions, discovery requests and responses, financial documents, and correspondence for court submission, managed case files and court calendars across multiple active matters, and prepared complete documentation for hearings and court proceedings. I e-filed documents in South Carolina state and federal courts and communicated regularly with clients, opposing counsel, and court personnel throughout the life of each case.</w:t>
       </w:r>
     </w:p>
     <w:p>
@@ -97,7 +157,7 @@
           <w:color w:val="000000"/>
           <w:sz w:val="24"/>
         </w:rPr>
-        <w:t>As a Juvenile Drug Court Program Coordinator, I supported attorneys in family court proceedings and served as a direct point of contact for families going through difficult legal situations. I provided consistent communication and guidance to clients throughout their cases, which I understand is a priority for your firm. I also coordinated across attorneys, judges, social workers, and treatment providers on a daily basis.</w:t>
+        <w:t>As a Juvenile Drug Court Program Coordinator at the Fifth Judicial Circuit Solicitor's Office, I supported attorneys in family court proceedings and served as a primary point of contact for families going through difficult legal situations. I provided consistent communication and updates to clients throughout their cases, which I understand is a priority in your firm's client-facing environment.</w:t>
       </w:r>
     </w:p>
     <w:p>
@@ -112,7 +172,7 @@
           <w:color w:val="000000"/>
           <w:sz w:val="24"/>
         </w:rPr>
-        <w:t>I am currently based in Charlotte and working as a Client Intake Coordinator at a family law firm where I manage client communications, draft legal documents, and maintain case records in Litify. I am comfortable adapting to new case management platforms and can get up to speed on MyCase quickly.</w:t>
+        <w:t>I am currently based in Charlotte and working as a Client Intake Coordinator at a family law firm, where I manage client communications, draft legal documents, and maintain case records in Litify. I am comfortable adapting to new case management platforms and can get up to speed on MyCase quickly. I am available to start immediately and would welcome the opportunity to support your attorneys during this busy period.</w:t>
       </w:r>
     </w:p>
     <w:p>
@@ -127,7 +187,7 @@
           <w:color w:val="000000"/>
           <w:sz w:val="24"/>
         </w:rPr>
-        <w:t>I am available to start immediately and would welcome the opportunity to support your attorneys during this busy period. Thank you for your consideration.</w:t>
+        <w:t>Thank you for your consideration. I look forward to speaking with you soon.</w:t>
       </w:r>
     </w:p>
     <w:p>
@@ -158,6 +218,21 @@
           <w:sz w:val="24"/>
         </w:rPr>
         <w:t>Myeisha L. Cheek</w:t>
+      </w:r>
+    </w:p>
+    <w:p>
+      <w:pPr>
+        <w:spacing w:before="0" w:after="60"/>
+        <w:jc w:val="left"/>
+      </w:pPr>
+      <w:r>
+        <w:rPr>
+          <w:rFonts w:ascii="Times New Roman" w:hAnsi="Times New Roman"/>
+          <w:b w:val="0"/>
+          <w:color w:val="000000"/>
+          <w:sz w:val="24"/>
+        </w:rPr>
+        <w:t>864-398-3096 | myeishacheek05@gmail.com</w:t>
       </w:r>
     </w:p>
     <w:sectPr>

</xml_diff>

<commit_message>
Rewrite all cover letters to connect experience to fit, not just list duties
Co-Authored-By: Claude Sonnet 4.6 <noreply@anthropic.com>
Claude-Session: https://claude.ai/code/session_01VXdBnAWV4RF8c2tdGsbE5P
</commit_message>
<xml_diff>
--- a/Myeisha_Cheek_CoverLetter_Family_Law_Paralegal_BeaconHill.docx
+++ b/Myeisha_Cheek_CoverLetter_Family_Law_Paralegal_BeaconHill.docx
@@ -127,7 +127,7 @@
           <w:color w:val="000000"/>
           <w:sz w:val="24"/>
         </w:rPr>
-        <w:t>I am writing to apply for the Family Law Paralegal position with your Charlotte office. With over five years of experience as a paralegal focused primarily on family law matters, I am confident in my ability to provide immediate, reliable support to your team of attorneys and contribute to your clients' cases from day one.</w:t>
+        <w:t>I am writing to apply for the Family Law Paralegal position with your Charlotte office. Family law is where I built my paralegal career, and it is the area where I am most confident in my ability to step in, get up to speed immediately, and provide real value to a legal team from day one.</w:t>
       </w:r>
     </w:p>
     <w:p>
@@ -142,7 +142,7 @@
           <w:color w:val="000000"/>
           <w:sz w:val="24"/>
         </w:rPr>
-        <w:t>At the Department of Social Services, I worked directly with attorneys on active family law litigation including child welfare cases, termination of parental rights, and custody disputes. I drafted pleadings, motions, discovery requests and responses, financial documents, and correspondence for court submission, managed case files and court calendars across multiple active matters, and prepared complete documentation for hearings and court proceedings. I e-filed documents in South Carolina state and federal courts and communicated regularly with clients, opposing counsel, and court personnel throughout the life of each case.</w:t>
+        <w:t>At the Department of Social Services, I was embedded in family court litigation every day — drafting pleadings, motions, discovery requests and responses, financial documents, and correspondence for court submission, while managing case files and court calendars across multiple active matters simultaneously. More importantly, I understood the human side of that work. Family law clients are not just files — they are people going through some of the hardest moments of their lives. I served as a direct point of contact for those clients, and I made it a priority to communicate clearly, respond promptly, and make sure they always knew where their case stood. That kind of consistent, compassionate client communication is something I take seriously, and it is exactly what your clients need.</w:t>
       </w:r>
     </w:p>
     <w:p>
@@ -157,7 +157,7 @@
           <w:color w:val="000000"/>
           <w:sz w:val="24"/>
         </w:rPr>
-        <w:t>As a Juvenile Drug Court Program Coordinator at the Fifth Judicial Circuit Solicitor's Office, I supported attorneys in family court proceedings and served as a primary point of contact for families going through difficult legal situations. I provided consistent communication and updates to clients throughout their cases, which I understand is a priority in your firm's client-facing environment.</w:t>
+        <w:t>As a Juvenile Drug Court Program Coordinator at the Fifth Judicial Circuit Solicitor's Office, I supported attorneys in family court proceedings and coordinated across legal counsel, social workers, judges, and families. That experience reinforced something I already believed: that a great paralegal does not just manage paperwork — they help hold the whole process together for everyone involved.</w:t>
       </w:r>
     </w:p>
     <w:p>
@@ -172,7 +172,7 @@
           <w:color w:val="000000"/>
           <w:sz w:val="24"/>
         </w:rPr>
-        <w:t>I am currently based in Charlotte and working as a Client Intake Coordinator at Cattie and Gonzalez, PLLC, a firm specializing in Medicare Secondary Payer law, where I manage client communications, draft legal documents, and maintain case records in Litify. I am comfortable adapting to new case management platforms and can get up to speed on MyCase quickly. I am available to start immediately and would welcome the opportunity to support your attorneys during this busy period.</w:t>
+        <w:t>I am currently based in Charlotte and working as a Client Intake Coordinator at Cattie and Gonzalez, PLLC, a Medicare Secondary Payer law firm, where I manage client communications, draft legal documents, and maintain case records in Litify. I can adapt to MyCase quickly and am available to start immediately. I would welcome the chance to bring my family law experience and client-first approach to your team.</w:t>
       </w:r>
     </w:p>
     <w:p>
@@ -187,7 +187,7 @@
           <w:color w:val="000000"/>
           <w:sz w:val="24"/>
         </w:rPr>
-        <w:t>Thank you for your consideration. I look forward to speaking with you soon.</w:t>
+        <w:t>Thank you for your time. I look forward to the conversation.</w:t>
       </w:r>
     </w:p>
     <w:p>

</xml_diff>

<commit_message>
Expand all cover letters to connect each role specifically to each job's requirements
Co-Authored-By: Claude Sonnet 4.6 <noreply@anthropic.com>
Claude-Session: https://claude.ai/code/session_01VXdBnAWV4RF8c2tdGsbE5P
</commit_message>
<xml_diff>
--- a/Myeisha_Cheek_CoverLetter_Family_Law_Paralegal_BeaconHill.docx
+++ b/Myeisha_Cheek_CoverLetter_Family_Law_Paralegal_BeaconHill.docx
@@ -127,7 +127,7 @@
           <w:color w:val="000000"/>
           <w:sz w:val="24"/>
         </w:rPr>
-        <w:t>I am writing to apply for the Family Law Paralegal position with your Charlotte office. Family law is where I built my paralegal career, and it is the area where I am most confident in my ability to step in, get up to speed immediately, and provide real value to a legal team from day one.</w:t>
+        <w:t>I am writing to apply for the Family Law Paralegal position with your Charlotte office. Family law is not a practice area I am trying to enter — it is the area where I have spent the majority of my paralegal career, and it is the work I am most prepared to do well. With over five years of direct family law litigation experience, I am ready to step in and support your three-attorney team from day one, without a long adjustment period.</w:t>
       </w:r>
     </w:p>
     <w:p>
@@ -142,7 +142,7 @@
           <w:color w:val="000000"/>
           <w:sz w:val="24"/>
         </w:rPr>
-        <w:t>At the Department of Social Services, I was embedded in family court litigation every day — drafting pleadings, motions, discovery requests and responses, financial documents, and correspondence for court submission, while managing case files and court calendars across multiple active matters simultaneously. More importantly, I understood the human side of that work. Family law clients are not just files — they are people going through some of the hardest moments of their lives. I served as a direct point of contact for those clients, and I made it a priority to communicate clearly, respond promptly, and make sure they always knew where their case stood. That kind of consistent, compassionate client communication is something I take seriously, and it is exactly what your clients need.</w:t>
+        <w:t>My most formative experience came as a Litigation Paralegal at the Department of Social Services, where I supported attorneys on complex family court matters every day. I drafted pleadings, motions, discovery requests and responses, court orders, and legal correspondence for court submission. I prepared financial documentation and case summaries for attorney review, organized and maintained complete case files, and ensured every document needed for a hearing or deposition was ready well in advance. I managed court calendars across multiple active matters simultaneously and e-filed in South Carolina state and federal courts. That experience gave me a thorough, working knowledge of family law litigation from the inside — not a textbook understanding, but the kind that comes from doing the work under real deadlines with real consequences.</w:t>
       </w:r>
     </w:p>
     <w:p>
@@ -157,7 +157,7 @@
           <w:color w:val="000000"/>
           <w:sz w:val="24"/>
         </w:rPr>
-        <w:t>As a Juvenile Drug Court Program Coordinator at the Fifth Judicial Circuit Solicitor's Office, I supported attorneys in family court proceedings and coordinated across legal counsel, social workers, judges, and families. That experience reinforced something I already believed: that a great paralegal does not just manage paperwork — they help hold the whole process together for everyone involved.</w:t>
+        <w:t>What that role also taught me is how to work with clients going through some of the hardest moments of their lives. Family law clients are not just cases — they are people dealing with custody disputes, parental rights, and family separation. I served as a direct point of contact for those clients throughout their proceedings, providing clear communication and consistent follow-up so they always knew where things stood. That kind of client relationship management is something I take seriously, and it is something I believe sets a strong family law paralegal apart from an average one.</w:t>
       </w:r>
     </w:p>
     <w:p>
@@ -172,7 +172,7 @@
           <w:color w:val="000000"/>
           <w:sz w:val="24"/>
         </w:rPr>
-        <w:t>I am currently based in Charlotte and working as a Client Intake Coordinator at Cattie and Gonzalez, PLLC, a Medicare Secondary Payer law firm, where I manage client communications, draft legal documents, and maintain case records in Litify. I can adapt to MyCase quickly and am available to start immediately. I would welcome the chance to bring my family law experience and client-first approach to your team.</w:t>
+        <w:t>As a Juvenile Drug Court Program Coordinator at the Fifth Judicial Circuit Solicitor's Office, I continued working at the intersection of family law and the court system, supporting attorneys in proceedings involving juvenile clients and their families, coordinating with judges, social workers, treatment providers, and families across multiple active matters. That role expanded my ability to manage complex, multi-party legal environments while keeping clients informed and supported.</w:t>
       </w:r>
     </w:p>
     <w:p>
@@ -187,7 +187,37 @@
           <w:color w:val="000000"/>
           <w:sz w:val="24"/>
         </w:rPr>
-        <w:t>Thank you for your time. I look forward to the conversation.</w:t>
+        <w:t>Currently, I work as a Client Intake Coordinator at Cattie and Gonzalez, PLLC, a Medicare Secondary Payer law firm in Charlotte, managing client communications, drafting legal documents, and maintaining case records in Litify. I can adapt quickly to MyCase, and I am available to start immediately. I am also completing a Master of Legal Studies at Wake Forest University School of Law.</w:t>
+      </w:r>
+    </w:p>
+    <w:p>
+      <w:pPr>
+        <w:spacing w:before="0" w:after="60"/>
+        <w:jc w:val="left"/>
+      </w:pPr>
+      <w:r>
+        <w:rPr>
+          <w:rFonts w:ascii="Times New Roman" w:hAnsi="Times New Roman"/>
+          <w:b w:val="0"/>
+          <w:color w:val="000000"/>
+          <w:sz w:val="24"/>
+        </w:rPr>
+        <w:t>I would bring deep family law experience, a client-first mindset, and the ability to work independently within a collaborative team. I look forward to the opportunity to discuss how I can contribute.</w:t>
+      </w:r>
+    </w:p>
+    <w:p>
+      <w:pPr>
+        <w:spacing w:before="0" w:after="60"/>
+        <w:jc w:val="left"/>
+      </w:pPr>
+      <w:r>
+        <w:rPr>
+          <w:rFonts w:ascii="Times New Roman" w:hAnsi="Times New Roman"/>
+          <w:b w:val="0"/>
+          <w:color w:val="000000"/>
+          <w:sz w:val="24"/>
+        </w:rPr>
+        <w:t>Thank you for your time and consideration.</w:t>
       </w:r>
     </w:p>
     <w:p>

</xml_diff>